<commit_message>
More references and fixing
</commit_message>
<xml_diff>
--- a/products/manuscript/Manuscript.docx
+++ b/products/manuscript/Manuscript.docx
@@ -168,7 +168,7 @@
         <w:t xml:space="preserve"> </w:t>
       </w:r>
       <w:r>
-        <w:t xml:space="preserve">(n.d.)</w:t>
+        <w:t xml:space="preserve">(2025)</w:t>
       </w:r>
       <w:r>
         <w:t xml:space="preserve">,</w:t>
@@ -183,7 +183,7 @@
         <w:t xml:space="preserve"> </w:t>
       </w:r>
       <w:r>
-        <w:t xml:space="preserve">(n.d.)</w:t>
+        <w:t xml:space="preserve">(2024)</w:t>
       </w:r>
       <w:r>
         <w:t xml:space="preserve">. As part of the effort to solve these issues, the CDC has ceated the BEAM (Bacteria, Enterics, Ameba, and Mycotics) Dashboard, which includes data from the System for Enteric Disease Response, Investigation, and Coordination (SEDRIC), National Antimicrobial Resistance Monitoring System for Enteric Bacteria (NARMS) and National Outbreak Reporting System (NORS). BEAM is a public tool to interact with and visualize data about pathogens, serotypes, antimicrobial resistance, HHS region, and burden of outbreak samples</w:t>
@@ -198,7 +198,7 @@
         <w:t xml:space="preserve"> </w:t>
       </w:r>
       <w:r>
-        <w:t xml:space="preserve">(n.d.)</w:t>
+        <w:t xml:space="preserve">(2026)</w:t>
       </w:r>
       <w:r>
         <w:t xml:space="preserve">. This study sought to use this publicly available data to determine whether the shared information was sufficient to get a reasonable picture of the current state of these outbreaks, including the antimicrobial resistance and specific pathogen burdens over space and time, and also make reliable predictions about future outbreaks, specifically:</w:t>
@@ -229,7 +229,7 @@
       </w:r>
     </w:p>
     <w:bookmarkEnd w:id="21"/>
-    <w:bookmarkStart w:id="24" w:name="methods"/>
+    <w:bookmarkStart w:id="25" w:name="methods"/>
     <w:p>
       <w:pPr>
         <w:pStyle w:val="Heading1"/>
@@ -256,7 +256,7 @@
       </w:r>
     </w:p>
     <w:bookmarkEnd w:id="22"/>
-    <w:bookmarkStart w:id="23" w:name="statistical-analysis"/>
+    <w:bookmarkStart w:id="24" w:name="statistical-analysis"/>
     <w:p>
       <w:pPr>
         <w:pStyle w:val="Heading2"/>
@@ -282,7 +282,7 @@
         <w:t xml:space="preserve"> </w:t>
       </w:r>
       <w:r>
-        <w:t xml:space="preserve">(n.d.)</w:t>
+        <w:t xml:space="preserve">(2026)</w:t>
       </w:r>
       <w:r>
         <w:t xml:space="preserve">,</w:t>
@@ -291,15 +291,29 @@
         <w:t xml:space="preserve"> </w:t>
       </w:r>
       <w:r>
-        <w:t xml:space="preserve">Handel (n.d.)</w:t>
-      </w:r>
-      <w:r>
-        <w:t xml:space="preserve">. They were assessed via fitting to three different models each, under 10-fold cross-validation on training data, and then presented with new, testing data for final assessment. The final model for each was selected using root mean square (RMSE) for the regression questions involved when the next outbreak will be and what the current state of antimicrobial resistance, and the classification questions were assessed using accuracy. Seasonality of the data was assessed via Poisson model and Type I (sequential) ANOVA with Chi-squred Likelihood Ratio. The forecast of future antimicrobial resistance was done via Autoregressive Integrated Moving Average (ARIMA), predicted with 80% and 95% confidence intervals. The code and data to reproduce the results are available at: xxx.</w:t>
-      </w:r>
-    </w:p>
-    <w:bookmarkEnd w:id="23"/>
+        <w:t xml:space="preserve">Handel (2026)</w:t>
+      </w:r>
+      <w:r>
+        <w:t xml:space="preserve">. They were assessed via fitting to three different models each, under 10-fold cross-validation on training data, and then presented with new, testing data for final assessment. The final model for each was selected using root mean square (RMSE) for the regression questions involved when the next outbreak will be and what the current state of antimicrobial resistance, and the classification questions were assessed using accuracy. Seasonality of the data was assessed via Poisson model and Type I (sequential) ANOVA with Chi-squred Likelihood Ratio. The forecast of future antimicrobial resistance was done via Autoregressive Integrated Moving Average (ARIMA), predicted with 80% and 95% confidence intervals. The code and data to reproduce the results are available at:</w:t>
+      </w:r>
+      <w:r>
+        <w:t xml:space="preserve"> </w:t>
+      </w:r>
+      <w:hyperlink r:id="rId23">
+        <w:r>
+          <w:rPr>
+            <w:rStyle w:val="Hyperlink"/>
+          </w:rPr>
+          <w:t xml:space="preserve">ADAMS-MADA-PROJECT</w:t>
+        </w:r>
+      </w:hyperlink>
+      <w:r>
+        <w:t xml:space="preserve">.</w:t>
+      </w:r>
+    </w:p>
     <w:bookmarkEnd w:id="24"/>
-    <w:bookmarkStart w:id="45" w:name="results"/>
+    <w:bookmarkEnd w:id="25"/>
+    <w:bookmarkStart w:id="46" w:name="results"/>
     <w:p>
       <w:pPr>
         <w:pStyle w:val="Heading1"/>
@@ -308,7 +322,7 @@
         <w:t xml:space="preserve">4. Results</w:t>
       </w:r>
     </w:p>
-    <w:bookmarkStart w:id="40" w:name="current-state-of-beam-outbreaks"/>
+    <w:bookmarkStart w:id="41" w:name="current-state-of-beam-outbreaks"/>
     <w:p>
       <w:pPr>
         <w:pStyle w:val="Heading2"/>
@@ -340,18 +354,18 @@
           <wp:inline>
             <wp:extent cx="4587290" cy="4587290"/>
             <wp:effectExtent b="0" l="0" r="0" t="0"/>
-            <wp:docPr descr="Outbreak Associated Isolates per State" title="" id="26" name="Picture"/>
+            <wp:docPr descr="Outbreak Associated Isolates per State" title="" id="27" name="Picture"/>
             <a:graphic>
               <a:graphicData uri="http://schemas.openxmlformats.org/drawingml/2006/picture">
                 <pic:pic>
                   <pic:nvPicPr>
-                    <pic:cNvPr descr="../../results/figures/faceted-states-isolates.png" id="27" name="Picture"/>
+                    <pic:cNvPr descr="../../results/figures/faceted-states-isolates.png" id="28" name="Picture"/>
                     <pic:cNvPicPr>
                       <a:picLocks noChangeArrowheads="1" noChangeAspect="1"/>
                     </pic:cNvPicPr>
                   </pic:nvPicPr>
                   <pic:blipFill>
-                    <a:blip r:embed="rId25"/>
+                    <a:blip r:embed="rId26"/>
                     <a:stretch>
                       <a:fillRect/>
                     </a:stretch>
@@ -403,18 +417,18 @@
           <wp:inline>
             <wp:extent cx="4587290" cy="4587290"/>
             <wp:effectExtent b="0" l="0" r="0" t="0"/>
-            <wp:docPr descr="Outbreak Associated Isolates Over Time" title="" id="29" name="Picture"/>
+            <wp:docPr descr="Outbreak Associated Isolates Over Time" title="" id="30" name="Picture"/>
             <a:graphic>
               <a:graphicData uri="http://schemas.openxmlformats.org/drawingml/2006/picture">
                 <pic:pic>
                   <pic:nvPicPr>
-                    <pic:cNvPr descr="../../results/figures/outbreaks-over-time.png" id="30" name="Picture"/>
+                    <pic:cNvPr descr="../../results/figures/outbreaks-over-time.png" id="31" name="Picture"/>
                     <pic:cNvPicPr>
                       <a:picLocks noChangeArrowheads="1" noChangeAspect="1"/>
                     </pic:cNvPicPr>
                   </pic:nvPicPr>
                   <pic:blipFill>
-                    <a:blip r:embed="rId28"/>
+                    <a:blip r:embed="rId29"/>
                     <a:stretch>
                       <a:fillRect/>
                     </a:stretch>
@@ -458,18 +472,18 @@
           <wp:inline>
             <wp:extent cx="4587290" cy="4587290"/>
             <wp:effectExtent b="0" l="0" r="0" t="0"/>
-            <wp:docPr descr="Average Outbreaks by Month" title="" id="32" name="Picture"/>
+            <wp:docPr descr="Average Outbreaks by Month" title="" id="33" name="Picture"/>
             <a:graphic>
               <a:graphicData uri="http://schemas.openxmlformats.org/drawingml/2006/picture">
                 <pic:pic>
                   <pic:nvPicPr>
-                    <pic:cNvPr descr="../../results/figures/outbreaks-per-month.png" id="33" name="Picture"/>
+                    <pic:cNvPr descr="../../results/figures/outbreaks-per-month.png" id="34" name="Picture"/>
                     <pic:cNvPicPr>
                       <a:picLocks noChangeArrowheads="1" noChangeAspect="1"/>
                     </pic:cNvPicPr>
                   </pic:nvPicPr>
                   <pic:blipFill>
-                    <a:blip r:embed="rId31"/>
+                    <a:blip r:embed="rId32"/>
                     <a:stretch>
                       <a:fillRect/>
                     </a:stretch>
@@ -584,7 +598,7 @@
         <w:t xml:space="preserve"> </w:t>
       </w:r>
       <w:r>
-        <w:t xml:space="preserve">(n.d.)</w:t>
+        <w:t xml:space="preserve">(2026)</w:t>
       </w:r>
       <w:r>
         <w:t xml:space="preserve">,</w:t>
@@ -593,7 +607,7 @@
         <w:t xml:space="preserve"> </w:t>
       </w:r>
       <w:r>
-        <w:t xml:space="preserve">Handel (n.d.)</w:t>
+        <w:t xml:space="preserve">Handel (2026)</w:t>
       </w:r>
       <w:r>
         <w:t xml:space="preserve">. Using total number of outbreak isolates as the outcome and just date as the predictor, the best fit model was a Linear Regression Model(RMSE 161, R-squared 0.615), a moderate fit. Other models included Poisson (RMSE 168, R-Squared 0.570) and Random Forest (RMSE 177, R-Squared 0.555). (Figure S3). This model indicated the trend to be a very slight decrease in overall number of outbreak associated isolates (Figure 4).</w:t>
@@ -608,18 +622,18 @@
           <wp:inline>
             <wp:extent cx="4587290" cy="4587290"/>
             <wp:effectExtent b="0" l="0" r="0" t="0"/>
-            <wp:docPr descr="Decreasing Trend of Outbreaks Over Time" title="" id="35" name="Picture"/>
+            <wp:docPr descr="Decreasing Trend of Outbreaks Over Time" title="" id="36" name="Picture"/>
             <a:graphic>
               <a:graphicData uri="http://schemas.openxmlformats.org/drawingml/2006/picture">
                 <pic:pic>
                   <pic:nvPicPr>
-                    <pic:cNvPr descr="../../results/figures/outbreak-time-trend-line.png" id="36" name="Picture"/>
+                    <pic:cNvPr descr="../../results/figures/outbreak-time-trend-line.png" id="37" name="Picture"/>
                     <pic:cNvPicPr>
                       <a:picLocks noChangeArrowheads="1" noChangeAspect="1"/>
                     </pic:cNvPicPr>
                   </pic:nvPicPr>
                   <pic:blipFill>
-                    <a:blip r:embed="rId34"/>
+                    <a:blip r:embed="rId35"/>
                     <a:stretch>
                       <a:fillRect/>
                     </a:stretch>
@@ -671,7 +685,7 @@
         <w:t xml:space="preserve"> </w:t>
       </w:r>
       <w:r>
-        <w:t xml:space="preserve">(n.d.)</w:t>
+        <w:t xml:space="preserve">(2026)</w:t>
       </w:r>
       <w:r>
         <w:t xml:space="preserve">,</w:t>
@@ -680,7 +694,7 @@
         <w:t xml:space="preserve"> </w:t>
       </w:r>
       <w:r>
-        <w:t xml:space="preserve">Handel (n.d.)</w:t>
+        <w:t xml:space="preserve">Handel (2026)</w:t>
       </w:r>
       <w:r>
         <w:t xml:space="preserve">. Other models included Exponential Smoothing (RMSE 28.1) and Prophet (RMSE 43, R-Squared 0.0252) (Figure S4). This model indicated an upward trend in the number of isolates with AMR (Figure 5).</w:t>
@@ -695,18 +709,18 @@
           <wp:inline>
             <wp:extent cx="4587290" cy="4587290"/>
             <wp:effectExtent b="0" l="0" r="0" t="0"/>
-            <wp:docPr descr="Increasing Trend of AMR Over Time" title="" id="38" name="Picture"/>
+            <wp:docPr descr="Increasing Trend of AMR Over Time" title="" id="39" name="Picture"/>
             <a:graphic>
               <a:graphicData uri="http://schemas.openxmlformats.org/drawingml/2006/picture">
                 <pic:pic>
                   <pic:nvPicPr>
-                    <pic:cNvPr descr="../../results/figures/amr-time-trend-line.png" id="39" name="Picture"/>
+                    <pic:cNvPr descr="../../results/figures/amr-time-trend-line.png" id="40" name="Picture"/>
                     <pic:cNvPicPr>
                       <a:picLocks noChangeArrowheads="1" noChangeAspect="1"/>
                     </pic:cNvPicPr>
                   </pic:nvPicPr>
                   <pic:blipFill>
-                    <a:blip r:embed="rId37"/>
+                    <a:blip r:embed="rId38"/>
                     <a:stretch>
                       <a:fillRect/>
                     </a:stretch>
@@ -741,8 +755,8 @@
         <w:t xml:space="preserve">Increasing Trend of AMR Over Time</w:t>
       </w:r>
     </w:p>
-    <w:bookmarkEnd w:id="40"/>
-    <w:bookmarkStart w:id="41" w:name="predicting-outbreak-beginning"/>
+    <w:bookmarkEnd w:id="41"/>
+    <w:bookmarkStart w:id="42" w:name="predicting-outbreak-beginning"/>
     <w:p>
       <w:pPr>
         <w:pStyle w:val="Heading2"/>
@@ -765,7 +779,7 @@
         <w:t xml:space="preserve"> </w:t>
       </w:r>
       <w:r>
-        <w:t xml:space="preserve">(n.d.)</w:t>
+        <w:t xml:space="preserve">(2026)</w:t>
       </w:r>
       <w:r>
         <w:t xml:space="preserve">,</w:t>
@@ -774,7 +788,7 @@
         <w:t xml:space="preserve"> </w:t>
       </w:r>
       <w:r>
-        <w:t xml:space="preserve">Handel (n.d.)</w:t>
+        <w:t xml:space="preserve">Handel (2026)</w:t>
       </w:r>
       <w:r>
         <w:t xml:space="preserve"> </w:t>
@@ -783,8 +797,8 @@
         <w:t xml:space="preserve">(Figure S5).</w:t>
       </w:r>
     </w:p>
-    <w:bookmarkEnd w:id="41"/>
-    <w:bookmarkStart w:id="42" w:name="predicting-outbreak-species"/>
+    <w:bookmarkEnd w:id="42"/>
+    <w:bookmarkStart w:id="43" w:name="predicting-outbreak-species"/>
     <w:p>
       <w:pPr>
         <w:pStyle w:val="Heading2"/>
@@ -807,7 +821,7 @@
         <w:t xml:space="preserve"> </w:t>
       </w:r>
       <w:r>
-        <w:t xml:space="preserve">(n.d.)</w:t>
+        <w:t xml:space="preserve">(2026)</w:t>
       </w:r>
       <w:r>
         <w:t xml:space="preserve">,</w:t>
@@ -816,7 +830,7 @@
         <w:t xml:space="preserve"> </w:t>
       </w:r>
       <w:r>
-        <w:t xml:space="preserve">Handel (n.d.)</w:t>
+        <w:t xml:space="preserve">Handel (2026)</w:t>
       </w:r>
       <w:r>
         <w:t xml:space="preserve"> </w:t>
@@ -825,8 +839,8 @@
         <w:t xml:space="preserve">(Figure S6).</w:t>
       </w:r>
     </w:p>
-    <w:bookmarkEnd w:id="42"/>
-    <w:bookmarkStart w:id="43" w:name="X9073ed5e18e5cbab64f0aecf5216e955d3988bf"/>
+    <w:bookmarkEnd w:id="43"/>
+    <w:bookmarkStart w:id="44" w:name="X9073ed5e18e5cbab64f0aecf5216e955d3988bf"/>
     <w:p>
       <w:pPr>
         <w:pStyle w:val="Heading2"/>
@@ -852,7 +866,7 @@
         <w:t xml:space="preserve"> </w:t>
       </w:r>
       <w:r>
-        <w:t xml:space="preserve">(n.d.)</w:t>
+        <w:t xml:space="preserve">(2026)</w:t>
       </w:r>
       <w:r>
         <w:t xml:space="preserve">,</w:t>
@@ -861,7 +875,7 @@
         <w:t xml:space="preserve"> </w:t>
       </w:r>
       <w:r>
-        <w:t xml:space="preserve">Handel (n.d.)</w:t>
+        <w:t xml:space="preserve">Handel (2026)</w:t>
       </w:r>
       <w:r>
         <w:t xml:space="preserve"> </w:t>
@@ -870,8 +884,8 @@
         <w:t xml:space="preserve">(Figure S7).</w:t>
       </w:r>
     </w:p>
-    <w:bookmarkEnd w:id="43"/>
-    <w:bookmarkStart w:id="44" w:name="predicting-outbreak-location"/>
+    <w:bookmarkEnd w:id="44"/>
+    <w:bookmarkStart w:id="45" w:name="predicting-outbreak-location"/>
     <w:p>
       <w:pPr>
         <w:pStyle w:val="Heading2"/>
@@ -897,7 +911,7 @@
         <w:t xml:space="preserve"> </w:t>
       </w:r>
       <w:r>
-        <w:t xml:space="preserve">(n.d.)</w:t>
+        <w:t xml:space="preserve">(2026)</w:t>
       </w:r>
       <w:r>
         <w:t xml:space="preserve">,</w:t>
@@ -906,7 +920,7 @@
         <w:t xml:space="preserve"> </w:t>
       </w:r>
       <w:r>
-        <w:t xml:space="preserve">Handel (n.d.)</w:t>
+        <w:t xml:space="preserve">Handel (2026)</w:t>
       </w:r>
       <w:r>
         <w:t xml:space="preserve"> </w:t>
@@ -915,9 +929,9 @@
         <w:t xml:space="preserve">(Figure S8).</w:t>
       </w:r>
     </w:p>
-    <w:bookmarkEnd w:id="44"/>
     <w:bookmarkEnd w:id="45"/>
-    <w:bookmarkStart w:id="49" w:name="discussion"/>
+    <w:bookmarkEnd w:id="46"/>
+    <w:bookmarkStart w:id="50" w:name="discussion"/>
     <w:p>
       <w:pPr>
         <w:pStyle w:val="Heading1"/>
@@ -926,7 +940,7 @@
         <w:t xml:space="preserve">5. Discussion</w:t>
       </w:r>
     </w:p>
-    <w:bookmarkStart w:id="46" w:name="summary-and-interpretation"/>
+    <w:bookmarkStart w:id="47" w:name="summary-and-interpretation"/>
     <w:p>
       <w:pPr>
         <w:pStyle w:val="Heading2"/>
@@ -968,7 +982,7 @@
         <w:t xml:space="preserve"> </w:t>
       </w:r>
       <w:r>
-        <w:t xml:space="preserve">(n.d.)</w:t>
+        <w:t xml:space="preserve">(2025)</w:t>
       </w:r>
       <w:r>
         <w:t xml:space="preserve">.</w:t>
@@ -1006,8 +1020,8 @@
         <w:t xml:space="preserve">Finally, I endeavoured to see if I would be able to predict the future outbreak locations. The best fit Random Forest Model only had an accuracy of 0.0127, indicating that despite the cross-validation and training, the model is unable to predicate a location for a future outbreak given the background information it was given. This is not entirely unexpected, again I think there are variables that could be missing that would make this a stronger model, but I don’t know if it would ever be possible to reliably predict where the next outbreak will be.</w:t>
       </w:r>
     </w:p>
-    <w:bookmarkEnd w:id="46"/>
-    <w:bookmarkStart w:id="47" w:name="strengths-and-limitations"/>
+    <w:bookmarkEnd w:id="47"/>
+    <w:bookmarkStart w:id="48" w:name="strengths-and-limitations"/>
     <w:p>
       <w:pPr>
         <w:pStyle w:val="Heading2"/>
@@ -1024,8 +1038,8 @@
         <w:t xml:space="preserve">This analysis was performed using limited publicly available data, and so a limitation of the study itself is that there are a number of other varaiables that influence disease outbreaks that are not represented in this dataset, so attempts to model and fit this data may not accurately represent real world scenarios. However, I think the number of different analyses performed to try to make sense of the data is a strength of the study.</w:t>
       </w:r>
     </w:p>
-    <w:bookmarkEnd w:id="47"/>
-    <w:bookmarkStart w:id="48" w:name="conclusions"/>
+    <w:bookmarkEnd w:id="48"/>
+    <w:bookmarkStart w:id="49" w:name="conclusions"/>
     <w:p>
       <w:pPr>
         <w:pStyle w:val="Heading2"/>
@@ -1047,9 +1061,9 @@
         <w:br w:type="page"/>
       </w:r>
     </w:p>
-    <w:bookmarkEnd w:id="48"/>
     <w:bookmarkEnd w:id="49"/>
-    <w:bookmarkStart w:id="63" w:name="references"/>
+    <w:bookmarkEnd w:id="50"/>
+    <w:bookmarkStart w:id="64" w:name="references"/>
     <w:p>
       <w:pPr>
         <w:pStyle w:val="Heading1"/>
@@ -1058,8 +1072,8 @@
         <w:t xml:space="preserve">6. References</w:t>
       </w:r>
     </w:p>
-    <w:bookmarkStart w:id="62" w:name="refs"/>
-    <w:bookmarkStart w:id="51" w:name="ref-Field"/>
+    <w:bookmarkStart w:id="63" w:name="refs"/>
+    <w:bookmarkStart w:id="52" w:name="ref-Field"/>
     <w:p>
       <w:pPr>
         <w:pStyle w:val="Bibliography"/>
@@ -1071,7 +1085,7 @@
         <w:t xml:space="preserve"> </w:t>
       </w:r>
       <w:r>
-        <w:t xml:space="preserve">n.d.</w:t>
+        <w:t xml:space="preserve">2024.</w:t>
       </w:r>
       <w:r>
         <w:t xml:space="preserve"> </w:t>
@@ -1089,7 +1103,7 @@
       <w:r>
         <w:t xml:space="preserve"> </w:t>
       </w:r>
-      <w:hyperlink r:id="rId50">
+      <w:hyperlink r:id="rId51">
         <w:r>
           <w:rPr>
             <w:rStyle w:val="Hyperlink"/>
@@ -1101,8 +1115,8 @@
         <w:t xml:space="preserve">.</w:t>
       </w:r>
     </w:p>
-    <w:bookmarkEnd w:id="51"/>
-    <w:bookmarkStart w:id="53" w:name="ref-BEAM"/>
+    <w:bookmarkEnd w:id="52"/>
+    <w:bookmarkStart w:id="54" w:name="ref-BEAM"/>
     <w:p>
       <w:pPr>
         <w:pStyle w:val="Bibliography"/>
@@ -1114,7 +1128,7 @@
         <w:t xml:space="preserve"> </w:t>
       </w:r>
       <w:r>
-        <w:t xml:space="preserve">n.d.</w:t>
+        <w:t xml:space="preserve">2026.</w:t>
       </w:r>
       <w:r>
         <w:t xml:space="preserve"> </w:t>
@@ -1132,7 +1146,7 @@
       <w:r>
         <w:t xml:space="preserve"> </w:t>
       </w:r>
-      <w:hyperlink r:id="rId52">
+      <w:hyperlink r:id="rId53">
         <w:r>
           <w:rPr>
             <w:rStyle w:val="Hyperlink"/>
@@ -1144,14 +1158,14 @@
         <w:t xml:space="preserve">.</w:t>
       </w:r>
     </w:p>
-    <w:bookmarkEnd w:id="53"/>
-    <w:bookmarkStart w:id="55" w:name="ref-Handel"/>
+    <w:bookmarkEnd w:id="54"/>
+    <w:bookmarkStart w:id="56" w:name="ref-Handel"/>
     <w:p>
       <w:pPr>
         <w:pStyle w:val="Bibliography"/>
       </w:pPr>
       <w:r>
-        <w:t xml:space="preserve">Handel, Andreas. n.d.</w:t>
+        <w:t xml:space="preserve">Handel, Andreas. 2026.</w:t>
       </w:r>
       <w:r>
         <w:t xml:space="preserve"> </w:t>
@@ -1175,7 +1189,7 @@
       <w:r>
         <w:t xml:space="preserve"> </w:t>
       </w:r>
-      <w:hyperlink r:id="rId54">
+      <w:hyperlink r:id="rId55">
         <w:r>
           <w:rPr>
             <w:rStyle w:val="Hyperlink"/>
@@ -1187,8 +1201,8 @@
         <w:t xml:space="preserve">.</w:t>
       </w:r>
     </w:p>
-    <w:bookmarkEnd w:id="55"/>
-    <w:bookmarkStart w:id="57" w:name="ref-SEDRIC"/>
+    <w:bookmarkEnd w:id="56"/>
+    <w:bookmarkStart w:id="58" w:name="ref-SEDRIC"/>
     <w:p>
       <w:pPr>
         <w:pStyle w:val="Bibliography"/>
@@ -1200,7 +1214,7 @@
         <w:t xml:space="preserve"> </w:t>
       </w:r>
       <w:r>
-        <w:t xml:space="preserve">n.d.</w:t>
+        <w:t xml:space="preserve">2025.</w:t>
       </w:r>
       <w:r>
         <w:t xml:space="preserve"> </w:t>
@@ -1218,7 +1232,7 @@
       <w:r>
         <w:t xml:space="preserve"> </w:t>
       </w:r>
-      <w:hyperlink r:id="rId56">
+      <w:hyperlink r:id="rId57">
         <w:r>
           <w:rPr>
             <w:rStyle w:val="Hyperlink"/>
@@ -1230,8 +1244,8 @@
         <w:t xml:space="preserve">.</w:t>
       </w:r>
     </w:p>
-    <w:bookmarkEnd w:id="57"/>
-    <w:bookmarkStart w:id="59" w:name="ref-tidymodels"/>
+    <w:bookmarkEnd w:id="58"/>
+    <w:bookmarkStart w:id="60" w:name="ref-tidymodels"/>
     <w:p>
       <w:pPr>
         <w:pStyle w:val="Bibliography"/>
@@ -1243,7 +1257,7 @@
         <w:t xml:space="preserve"> </w:t>
       </w:r>
       <w:r>
-        <w:t xml:space="preserve">n.d.</w:t>
+        <w:t xml:space="preserve">2026.</w:t>
       </w:r>
       <w:r>
         <w:t xml:space="preserve"> </w:t>
@@ -1261,7 +1275,7 @@
       <w:r>
         <w:t xml:space="preserve"> </w:t>
       </w:r>
-      <w:hyperlink r:id="rId58">
+      <w:hyperlink r:id="rId59">
         <w:r>
           <w:rPr>
             <w:rStyle w:val="Hyperlink"/>
@@ -1273,8 +1287,8 @@
         <w:t xml:space="preserve">.</w:t>
       </w:r>
     </w:p>
-    <w:bookmarkEnd w:id="59"/>
-    <w:bookmarkStart w:id="61" w:name="ref-WHO"/>
+    <w:bookmarkEnd w:id="60"/>
+    <w:bookmarkStart w:id="62" w:name="ref-WHO"/>
     <w:p>
       <w:pPr>
         <w:pStyle w:val="Bibliography"/>
@@ -1286,7 +1300,7 @@
         <w:t xml:space="preserve"> </w:t>
       </w:r>
       <w:r>
-        <w:t xml:space="preserve">n.d.</w:t>
+        <w:t xml:space="preserve">2025.</w:t>
       </w:r>
       <w:r>
         <w:t xml:space="preserve"> </w:t>
@@ -1304,7 +1318,7 @@
       <w:r>
         <w:t xml:space="preserve"> </w:t>
       </w:r>
-      <w:hyperlink r:id="rId60">
+      <w:hyperlink r:id="rId61">
         <w:r>
           <w:rPr>
             <w:rStyle w:val="Hyperlink"/>
@@ -1316,9 +1330,9 @@
         <w:t xml:space="preserve">.</w:t>
       </w:r>
     </w:p>
-    <w:bookmarkEnd w:id="61"/>
     <w:bookmarkEnd w:id="62"/>
     <w:bookmarkEnd w:id="63"/>
+    <w:bookmarkEnd w:id="64"/>
     <w:sectPr>
       <w:footnotePr>
         <w:numRestart w:val="eachSect"/>

</xml_diff>

<commit_message>
Getting rid of unnecessary stuff, again.
</commit_message>
<xml_diff>
--- a/products/manuscript/Manuscript.docx
+++ b/products/manuscript/Manuscript.docx
@@ -124,7 +124,26 @@
         <w:t xml:space="preserve">author’s own and don’t reflect their employer.</w:t>
       </w:r>
     </w:p>
-    <w:bookmarkStart w:id="20" w:name="abstract"/>
+    <w:p>
+      <w:pPr>
+        <w:pStyle w:val="BodyText"/>
+      </w:pPr>
+      <w:r>
+        <w:t xml:space="preserve">Supplementary material:</w:t>
+      </w:r>
+      <w:r>
+        <w:t xml:space="preserve"> </w:t>
+      </w:r>
+      <w:hyperlink r:id="rId20">
+        <w:r>
+          <w:rPr>
+            <w:rStyle w:val="Hyperlink"/>
+          </w:rPr>
+          <w:t xml:space="preserve">Supplement</w:t>
+        </w:r>
+      </w:hyperlink>
+    </w:p>
+    <w:bookmarkStart w:id="21" w:name="abstract"/>
     <w:p>
       <w:pPr>
         <w:pStyle w:val="Heading1"/>
@@ -141,8 +160,8 @@
         <w:t xml:space="preserve">The detection and prevention of infectious disease outbreaks is a core component of public health work, and publicly available data is a useful tool in the identification of patterns in outbreak data to be used for the future. This study used publicly available BEAM Dashboard data to demonstrate the utility of this data by determining patterns in outbreaks over time and predicting key features of future outbreaks.</w:t>
       </w:r>
     </w:p>
-    <w:bookmarkEnd w:id="20"/>
-    <w:bookmarkStart w:id="21" w:name="introduction"/>
+    <w:bookmarkEnd w:id="21"/>
+    <w:bookmarkStart w:id="22" w:name="introduction"/>
     <w:p>
       <w:pPr>
         <w:pStyle w:val="Heading1"/>
@@ -228,8 +247,8 @@
         <w:t xml:space="preserve">- Can it be used to predict where the next outbreak will be?</w:t>
       </w:r>
     </w:p>
-    <w:bookmarkEnd w:id="21"/>
-    <w:bookmarkStart w:id="25" w:name="methods"/>
+    <w:bookmarkEnd w:id="22"/>
+    <w:bookmarkStart w:id="26" w:name="methods"/>
     <w:p>
       <w:pPr>
         <w:pStyle w:val="Heading1"/>
@@ -238,7 +257,7 @@
         <w:t xml:space="preserve">3. Methods</w:t>
       </w:r>
     </w:p>
-    <w:bookmarkStart w:id="22" w:name="data-import-and-cleaning"/>
+    <w:bookmarkStart w:id="23" w:name="data-import-and-cleaning"/>
     <w:p>
       <w:pPr>
         <w:pStyle w:val="Heading2"/>
@@ -255,8 +274,8 @@
         <w:t xml:space="preserve">The data utilized in this study was imported directly from the BEAM dashboard Report Data. Many of the entries were incomplete, and so to maximize the data that I identified as having an impact on the questions of interest, 7 rows with missing State column datan and rows that did not have any information in the Outbreak Associated Isolates column were removed. Further, columns that I did not intend to use in my analysis were also removed, including Source Type, Source Site, New multistate outbreaks, New multistate outbreaks - US, and Number of Sequenced Isolates Analyzed by NARMS were also removed. Columns Year and Month were used to make a column called Date and were then also removed. A column called Number of Outbreak Isolates with Atimicrobial Resistance was created using columns Outbreak Associated Isolates and % Isolates with Clinically Important Antimicrobial Resistance, after which % Isolates with Clinically Important Antimicrobial Resistance was removed. A binary column, called is_outbreak, describing whether the information in the column described an outbreak or not, was also created using the column Outbreak Associated Isolates. Finally, columns Pathogen and Serotype/Species were used to create another column combining them called genus_species, after which the originals were removed. The remaining columns used for the analysis were State, Number of Isolates, Number of Outbreak Isolates with Atimicrobial Resistance, date, genus_species, and is_outbreak. Additional columns were added when addressing each question in order to best prepare.</w:t>
       </w:r>
     </w:p>
-    <w:bookmarkEnd w:id="22"/>
-    <w:bookmarkStart w:id="24" w:name="statistical-analysis"/>
+    <w:bookmarkEnd w:id="23"/>
+    <w:bookmarkStart w:id="25" w:name="statistical-analysis"/>
     <w:p>
       <w:pPr>
         <w:pStyle w:val="Heading2"/>
@@ -299,7 +318,7 @@
       <w:r>
         <w:t xml:space="preserve"> </w:t>
       </w:r>
-      <w:hyperlink r:id="rId23">
+      <w:hyperlink r:id="rId24">
         <w:r>
           <w:rPr>
             <w:rStyle w:val="Hyperlink"/>
@@ -311,9 +330,9 @@
         <w:t xml:space="preserve">.</w:t>
       </w:r>
     </w:p>
-    <w:bookmarkEnd w:id="24"/>
     <w:bookmarkEnd w:id="25"/>
-    <w:bookmarkStart w:id="46" w:name="results"/>
+    <w:bookmarkEnd w:id="26"/>
+    <w:bookmarkStart w:id="47" w:name="results"/>
     <w:p>
       <w:pPr>
         <w:pStyle w:val="Heading1"/>
@@ -322,7 +341,7 @@
         <w:t xml:space="preserve">4. Results</w:t>
       </w:r>
     </w:p>
-    <w:bookmarkStart w:id="41" w:name="current-state-of-beam-outbreaks"/>
+    <w:bookmarkStart w:id="42" w:name="current-state-of-beam-outbreaks"/>
     <w:p>
       <w:pPr>
         <w:pStyle w:val="Heading2"/>
@@ -354,18 +373,18 @@
           <wp:inline>
             <wp:extent cx="4587290" cy="4587290"/>
             <wp:effectExtent b="0" l="0" r="0" t="0"/>
-            <wp:docPr descr="Outbreak Associated Isolates per State" title="" id="27" name="Picture"/>
+            <wp:docPr descr="Outbreak Associated Isolates per State" title="" id="28" name="Picture"/>
             <a:graphic>
               <a:graphicData uri="http://schemas.openxmlformats.org/drawingml/2006/picture">
                 <pic:pic>
                   <pic:nvPicPr>
-                    <pic:cNvPr descr="../../results/figures/faceted-states-isolates.png" id="28" name="Picture"/>
+                    <pic:cNvPr descr="../../results/figures/faceted-states-isolates.png" id="29" name="Picture"/>
                     <pic:cNvPicPr>
                       <a:picLocks noChangeArrowheads="1" noChangeAspect="1"/>
                     </pic:cNvPicPr>
                   </pic:nvPicPr>
                   <pic:blipFill>
-                    <a:blip r:embed="rId26"/>
+                    <a:blip r:embed="rId27"/>
                     <a:stretch>
                       <a:fillRect/>
                     </a:stretch>
@@ -417,18 +436,18 @@
           <wp:inline>
             <wp:extent cx="4587290" cy="4587290"/>
             <wp:effectExtent b="0" l="0" r="0" t="0"/>
-            <wp:docPr descr="Outbreak Associated Isolates Over Time" title="" id="30" name="Picture"/>
+            <wp:docPr descr="Outbreak Associated Isolates Over Time" title="" id="31" name="Picture"/>
             <a:graphic>
               <a:graphicData uri="http://schemas.openxmlformats.org/drawingml/2006/picture">
                 <pic:pic>
                   <pic:nvPicPr>
-                    <pic:cNvPr descr="../../results/figures/outbreaks-over-time.png" id="31" name="Picture"/>
+                    <pic:cNvPr descr="../../results/figures/outbreaks-over-time.png" id="32" name="Picture"/>
                     <pic:cNvPicPr>
                       <a:picLocks noChangeArrowheads="1" noChangeAspect="1"/>
                     </pic:cNvPicPr>
                   </pic:nvPicPr>
                   <pic:blipFill>
-                    <a:blip r:embed="rId29"/>
+                    <a:blip r:embed="rId30"/>
                     <a:stretch>
                       <a:fillRect/>
                     </a:stretch>
@@ -472,18 +491,18 @@
           <wp:inline>
             <wp:extent cx="4587290" cy="4587290"/>
             <wp:effectExtent b="0" l="0" r="0" t="0"/>
-            <wp:docPr descr="Average Outbreaks by Month" title="" id="33" name="Picture"/>
+            <wp:docPr descr="Average Outbreaks by Month" title="" id="34" name="Picture"/>
             <a:graphic>
               <a:graphicData uri="http://schemas.openxmlformats.org/drawingml/2006/picture">
                 <pic:pic>
                   <pic:nvPicPr>
-                    <pic:cNvPr descr="../../results/figures/outbreaks-per-month.png" id="34" name="Picture"/>
+                    <pic:cNvPr descr="../../results/figures/outbreaks-per-month.png" id="35" name="Picture"/>
                     <pic:cNvPicPr>
                       <a:picLocks noChangeArrowheads="1" noChangeAspect="1"/>
                     </pic:cNvPicPr>
                   </pic:nvPicPr>
                   <pic:blipFill>
-                    <a:blip r:embed="rId32"/>
+                    <a:blip r:embed="rId33"/>
                     <a:stretch>
                       <a:fillRect/>
                     </a:stretch>
@@ -622,18 +641,18 @@
           <wp:inline>
             <wp:extent cx="4587290" cy="4587290"/>
             <wp:effectExtent b="0" l="0" r="0" t="0"/>
-            <wp:docPr descr="Decreasing Trend of Outbreaks Over Time" title="" id="36" name="Picture"/>
+            <wp:docPr descr="Decreasing Trend of Outbreaks Over Time" title="" id="37" name="Picture"/>
             <a:graphic>
               <a:graphicData uri="http://schemas.openxmlformats.org/drawingml/2006/picture">
                 <pic:pic>
                   <pic:nvPicPr>
-                    <pic:cNvPr descr="../../results/figures/outbreak-time-trend-line.png" id="37" name="Picture"/>
+                    <pic:cNvPr descr="../../results/figures/outbreak-time-trend-line.png" id="38" name="Picture"/>
                     <pic:cNvPicPr>
                       <a:picLocks noChangeArrowheads="1" noChangeAspect="1"/>
                     </pic:cNvPicPr>
                   </pic:nvPicPr>
                   <pic:blipFill>
-                    <a:blip r:embed="rId35"/>
+                    <a:blip r:embed="rId36"/>
                     <a:stretch>
                       <a:fillRect/>
                     </a:stretch>
@@ -709,18 +728,18 @@
           <wp:inline>
             <wp:extent cx="4587290" cy="4587290"/>
             <wp:effectExtent b="0" l="0" r="0" t="0"/>
-            <wp:docPr descr="Increasing Trend of AMR Over Time" title="" id="39" name="Picture"/>
+            <wp:docPr descr="Increasing Trend of AMR Over Time" title="" id="40" name="Picture"/>
             <a:graphic>
               <a:graphicData uri="http://schemas.openxmlformats.org/drawingml/2006/picture">
                 <pic:pic>
                   <pic:nvPicPr>
-                    <pic:cNvPr descr="../../results/figures/amr-time-trend-line.png" id="40" name="Picture"/>
+                    <pic:cNvPr descr="../../results/figures/amr-time-trend-line.png" id="41" name="Picture"/>
                     <pic:cNvPicPr>
                       <a:picLocks noChangeArrowheads="1" noChangeAspect="1"/>
                     </pic:cNvPicPr>
                   </pic:nvPicPr>
                   <pic:blipFill>
-                    <a:blip r:embed="rId38"/>
+                    <a:blip r:embed="rId39"/>
                     <a:stretch>
                       <a:fillRect/>
                     </a:stretch>
@@ -755,8 +774,8 @@
         <w:t xml:space="preserve">Increasing Trend of AMR Over Time</w:t>
       </w:r>
     </w:p>
-    <w:bookmarkEnd w:id="41"/>
-    <w:bookmarkStart w:id="42" w:name="predicting-outbreak-beginning"/>
+    <w:bookmarkEnd w:id="42"/>
+    <w:bookmarkStart w:id="43" w:name="predicting-outbreak-beginning"/>
     <w:p>
       <w:pPr>
         <w:pStyle w:val="Heading2"/>
@@ -797,8 +816,8 @@
         <w:t xml:space="preserve">(Figure S5).</w:t>
       </w:r>
     </w:p>
-    <w:bookmarkEnd w:id="42"/>
-    <w:bookmarkStart w:id="43" w:name="predicting-outbreak-species"/>
+    <w:bookmarkEnd w:id="43"/>
+    <w:bookmarkStart w:id="44" w:name="predicting-outbreak-species"/>
     <w:p>
       <w:pPr>
         <w:pStyle w:val="Heading2"/>
@@ -839,8 +858,8 @@
         <w:t xml:space="preserve">(Figure S6).</w:t>
       </w:r>
     </w:p>
-    <w:bookmarkEnd w:id="43"/>
-    <w:bookmarkStart w:id="44" w:name="X9073ed5e18e5cbab64f0aecf5216e955d3988bf"/>
+    <w:bookmarkEnd w:id="44"/>
+    <w:bookmarkStart w:id="45" w:name="X9073ed5e18e5cbab64f0aecf5216e955d3988bf"/>
     <w:p>
       <w:pPr>
         <w:pStyle w:val="Heading2"/>
@@ -884,8 +903,8 @@
         <w:t xml:space="preserve">(Figure S7).</w:t>
       </w:r>
     </w:p>
-    <w:bookmarkEnd w:id="44"/>
-    <w:bookmarkStart w:id="45" w:name="predicting-outbreak-location"/>
+    <w:bookmarkEnd w:id="45"/>
+    <w:bookmarkStart w:id="46" w:name="predicting-outbreak-location"/>
     <w:p>
       <w:pPr>
         <w:pStyle w:val="Heading2"/>
@@ -929,9 +948,9 @@
         <w:t xml:space="preserve">(Figure S8).</w:t>
       </w:r>
     </w:p>
-    <w:bookmarkEnd w:id="45"/>
     <w:bookmarkEnd w:id="46"/>
-    <w:bookmarkStart w:id="50" w:name="discussion"/>
+    <w:bookmarkEnd w:id="47"/>
+    <w:bookmarkStart w:id="51" w:name="discussion"/>
     <w:p>
       <w:pPr>
         <w:pStyle w:val="Heading1"/>
@@ -940,7 +959,7 @@
         <w:t xml:space="preserve">5. Discussion</w:t>
       </w:r>
     </w:p>
-    <w:bookmarkStart w:id="47" w:name="summary-and-interpretation"/>
+    <w:bookmarkStart w:id="48" w:name="summary-and-interpretation"/>
     <w:p>
       <w:pPr>
         <w:pStyle w:val="Heading2"/>
@@ -1020,8 +1039,8 @@
         <w:t xml:space="preserve">Finally, I endeavoured to see if I would be able to predict the future outbreak locations. The best fit Random Forest Model only had an accuracy of 0.0127, indicating that despite the cross-validation and training, the model is unable to predicate a location for a future outbreak given the background information it was given. This is not entirely unexpected, again I think there are variables that could be missing that would make this a stronger model, but I don’t know if it would ever be possible to reliably predict where the next outbreak will be.</w:t>
       </w:r>
     </w:p>
-    <w:bookmarkEnd w:id="47"/>
-    <w:bookmarkStart w:id="48" w:name="strengths-and-limitations"/>
+    <w:bookmarkEnd w:id="48"/>
+    <w:bookmarkStart w:id="49" w:name="strengths-and-limitations"/>
     <w:p>
       <w:pPr>
         <w:pStyle w:val="Heading2"/>
@@ -1038,8 +1057,8 @@
         <w:t xml:space="preserve">This analysis was performed using limited publicly available data, and so a limitation of the study itself is that there are a number of other varaiables that influence disease outbreaks that are not represented in this dataset, so attempts to model and fit this data may not accurately represent real world scenarios. However, I think the number of different analyses performed to try to make sense of the data is a strength of the study.</w:t>
       </w:r>
     </w:p>
-    <w:bookmarkEnd w:id="48"/>
-    <w:bookmarkStart w:id="49" w:name="conclusions"/>
+    <w:bookmarkEnd w:id="49"/>
+    <w:bookmarkStart w:id="50" w:name="conclusions"/>
     <w:p>
       <w:pPr>
         <w:pStyle w:val="Heading2"/>
@@ -1061,9 +1080,9 @@
         <w:br w:type="page"/>
       </w:r>
     </w:p>
-    <w:bookmarkEnd w:id="49"/>
     <w:bookmarkEnd w:id="50"/>
-    <w:bookmarkStart w:id="64" w:name="references"/>
+    <w:bookmarkEnd w:id="51"/>
+    <w:bookmarkStart w:id="65" w:name="references"/>
     <w:p>
       <w:pPr>
         <w:pStyle w:val="Heading1"/>
@@ -1072,8 +1091,8 @@
         <w:t xml:space="preserve">6. References</w:t>
       </w:r>
     </w:p>
-    <w:bookmarkStart w:id="63" w:name="refs"/>
-    <w:bookmarkStart w:id="52" w:name="ref-Field"/>
+    <w:bookmarkStart w:id="64" w:name="refs"/>
+    <w:bookmarkStart w:id="53" w:name="ref-Field"/>
     <w:p>
       <w:pPr>
         <w:pStyle w:val="Bibliography"/>
@@ -1103,7 +1122,7 @@
       <w:r>
         <w:t xml:space="preserve"> </w:t>
       </w:r>
-      <w:hyperlink r:id="rId51">
+      <w:hyperlink r:id="rId52">
         <w:r>
           <w:rPr>
             <w:rStyle w:val="Hyperlink"/>
@@ -1115,8 +1134,8 @@
         <w:t xml:space="preserve">.</w:t>
       </w:r>
     </w:p>
-    <w:bookmarkEnd w:id="52"/>
-    <w:bookmarkStart w:id="54" w:name="ref-BEAM"/>
+    <w:bookmarkEnd w:id="53"/>
+    <w:bookmarkStart w:id="55" w:name="ref-BEAM"/>
     <w:p>
       <w:pPr>
         <w:pStyle w:val="Bibliography"/>
@@ -1146,7 +1165,7 @@
       <w:r>
         <w:t xml:space="preserve"> </w:t>
       </w:r>
-      <w:hyperlink r:id="rId53">
+      <w:hyperlink r:id="rId54">
         <w:r>
           <w:rPr>
             <w:rStyle w:val="Hyperlink"/>
@@ -1158,8 +1177,8 @@
         <w:t xml:space="preserve">.</w:t>
       </w:r>
     </w:p>
-    <w:bookmarkEnd w:id="54"/>
-    <w:bookmarkStart w:id="56" w:name="ref-Handel"/>
+    <w:bookmarkEnd w:id="55"/>
+    <w:bookmarkStart w:id="57" w:name="ref-Handel"/>
     <w:p>
       <w:pPr>
         <w:pStyle w:val="Bibliography"/>
@@ -1189,7 +1208,7 @@
       <w:r>
         <w:t xml:space="preserve"> </w:t>
       </w:r>
-      <w:hyperlink r:id="rId55">
+      <w:hyperlink r:id="rId56">
         <w:r>
           <w:rPr>
             <w:rStyle w:val="Hyperlink"/>
@@ -1201,8 +1220,8 @@
         <w:t xml:space="preserve">.</w:t>
       </w:r>
     </w:p>
-    <w:bookmarkEnd w:id="56"/>
-    <w:bookmarkStart w:id="58" w:name="ref-SEDRIC"/>
+    <w:bookmarkEnd w:id="57"/>
+    <w:bookmarkStart w:id="59" w:name="ref-SEDRIC"/>
     <w:p>
       <w:pPr>
         <w:pStyle w:val="Bibliography"/>
@@ -1232,7 +1251,7 @@
       <w:r>
         <w:t xml:space="preserve"> </w:t>
       </w:r>
-      <w:hyperlink r:id="rId57">
+      <w:hyperlink r:id="rId58">
         <w:r>
           <w:rPr>
             <w:rStyle w:val="Hyperlink"/>
@@ -1244,8 +1263,8 @@
         <w:t xml:space="preserve">.</w:t>
       </w:r>
     </w:p>
-    <w:bookmarkEnd w:id="58"/>
-    <w:bookmarkStart w:id="60" w:name="ref-tidymodels"/>
+    <w:bookmarkEnd w:id="59"/>
+    <w:bookmarkStart w:id="61" w:name="ref-tidymodels"/>
     <w:p>
       <w:pPr>
         <w:pStyle w:val="Bibliography"/>
@@ -1275,7 +1294,7 @@
       <w:r>
         <w:t xml:space="preserve"> </w:t>
       </w:r>
-      <w:hyperlink r:id="rId59">
+      <w:hyperlink r:id="rId60">
         <w:r>
           <w:rPr>
             <w:rStyle w:val="Hyperlink"/>
@@ -1287,8 +1306,8 @@
         <w:t xml:space="preserve">.</w:t>
       </w:r>
     </w:p>
-    <w:bookmarkEnd w:id="60"/>
-    <w:bookmarkStart w:id="62" w:name="ref-WHO"/>
+    <w:bookmarkEnd w:id="61"/>
+    <w:bookmarkStart w:id="63" w:name="ref-WHO"/>
     <w:p>
       <w:pPr>
         <w:pStyle w:val="Bibliography"/>
@@ -1318,7 +1337,7 @@
       <w:r>
         <w:t xml:space="preserve"> </w:t>
       </w:r>
-      <w:hyperlink r:id="rId61">
+      <w:hyperlink r:id="rId62">
         <w:r>
           <w:rPr>
             <w:rStyle w:val="Hyperlink"/>
@@ -1330,9 +1349,9 @@
         <w:t xml:space="preserve">.</w:t>
       </w:r>
     </w:p>
-    <w:bookmarkEnd w:id="62"/>
     <w:bookmarkEnd w:id="63"/>
     <w:bookmarkEnd w:id="64"/>
+    <w:bookmarkEnd w:id="65"/>
     <w:sectPr>
       <w:footnotePr>
         <w:numRestart w:val="eachSect"/>

</xml_diff>